<commit_message>
final pass on Chapter 8: Bears and Wolves, Oh My
</commit_message>
<xml_diff>
--- a/8 - Bears and Wolves Oh My.docx
+++ b/8 - Bears and Wolves Oh My.docx
@@ -5,7 +5,7 @@
   <w:body>
     <w:p>
       <w:pPr>
-        <w:pStyle w:val="Heading1"/>
+        <w:pStyle w:val="Heading2"/>
       </w:pPr>
       <w:bookmarkStart w:id="0" w:name="_Toc234028657"/>
       <w:bookmarkStart w:id="1" w:name="_Toc234078195"/>
@@ -76,10 +76,10 @@
           <w:i/>
           <w:iCs/>
         </w:rPr>
-        <w:t>Yup, he loves her</w:t>
-      </w:r>
-      <w:r>
-        <w:t>. Frank announces, “Let’s eat! Who’s ready for some spaghetti and meatballs?”</w:t>
+        <w:t>Yup, he loves her.</w:t>
+      </w:r>
+      <w:r>
+        <w:t xml:space="preserve"> Frank announces, “Let’s eat! Who’s ready for some spaghetti and meatballs?”</w:t>
       </w:r>
     </w:p>
     <w:p>
@@ -125,23 +125,7 @@
     <w:p>
       <w:r>
         <w:lastRenderedPageBreak/>
-        <w:t xml:space="preserve">Lisa snorts as she starts unloading the bottles from the slings. “That’s because they aren’t exactly compatible in the genetics department. Kaya, as a painted dog, </w:t>
-      </w:r>
-      <w:proofErr w:type="spellStart"/>
-      <w:r>
-        <w:t>ain’t</w:t>
-      </w:r>
-      <w:proofErr w:type="spellEnd"/>
-      <w:r>
-        <w:t xml:space="preserve"> even a dog really. Lea, these slings are gorgeous. Where did you get them? </w:t>
-      </w:r>
-      <w:proofErr w:type="spellStart"/>
-      <w:r>
-        <w:t>Oooh</w:t>
-      </w:r>
-      <w:proofErr w:type="spellEnd"/>
-      <w:r>
-        <w:t>, berry wines.” She rubs her hands together and goes to the bar in the den to retrieve three goblets.</w:t>
+        <w:t>Lisa snorts as she starts unloading the bottles from the slings. “That’s because they aren’t exactly compatible in the genetics department. Kaya, as a painted dog, ain’t even a dog really. Lea, these slings are gorgeous. Where did you get them? Oooh, berry wines.” She rubs her hands together and goes to the bar in the den to retrieve three goblets.</w:t>
       </w:r>
     </w:p>
     <w:p>
@@ -203,10 +187,10 @@
           <w:i/>
           <w:iCs/>
         </w:rPr>
-        <w:t>Alcohol. Right. But not a drink, not a slip, just a kiss. Settle down, man</w:t>
-      </w:r>
-      <w:r>
-        <w:t>. He lets the thought pass and turns with the others to watch Lea with the children.</w:t>
+        <w:t>Alcohol. Right. But not a drink, not a slip, just a kiss. Settle down, man.</w:t>
+      </w:r>
+      <w:r>
+        <w:t xml:space="preserve"> He lets the thought pass and turns with the others to watch Lea with the children.</w:t>
       </w:r>
     </w:p>
     <w:p>
@@ -224,248 +208,223 @@
           <w:i/>
           <w:iCs/>
         </w:rPr>
-        <w:t xml:space="preserve">On Top </w:t>
+        <w:t>On Top of Spaghetti.</w:t>
+      </w:r>
+      <w:r>
+        <w:t xml:space="preserve"> The children join with the men, all singing at the top of their lungs, while the women look on in part shock, part disbelief, and part heaven help us.</w:t>
+      </w:r>
+    </w:p>
+    <w:p>
+      <w:r>
+        <w:t>The men move to the table, standing with a child on each side as they make faces and lean into the song with the kids. Lea steps back, afraid of the scene she sees coming but powerless to stop it. As they reach the last line of the parody, the kids start fake sneezing while the men start making meatballs disappear by popping them in their mouths. The kids look on in shock while the men grin from ear to ear, chewing the meatballs. Al looks at Davey and loudly proclaims, “Eww! Daddy just ate boogies!” The men choke on their meatballs while everyone else lets loose in laughter, grabbing their sides.</w:t>
+      </w:r>
+    </w:p>
+    <w:p>
+      <w:r>
+        <w:t>How nothing gets turned over and food worn on shirts is still something that amazes the women. Lea regains her posture first. “You three troublemakers back to the kitchen with you and let them finish in peace.”</w:t>
+      </w:r>
+    </w:p>
+    <w:p>
+      <w:r>
+        <w:t>Lonnie points out, “But Miss Lea, we are finished. See all plates clean.”</w:t>
+      </w:r>
+    </w:p>
+    <w:p>
+      <w:r>
+        <w:t>Sam chimes in, “Wait! We still have milk. Okay, everyone. One… two… three. Chug!” The children grab their milk glasses and start drinking it down fast like frat boys.</w:t>
+      </w:r>
+    </w:p>
+    <w:p>
+      <w:r>
+        <w:t>Lea cocks an eyebrow at Davey and Frank. “I wonder where they learned that?”</w:t>
+      </w:r>
+    </w:p>
+    <w:p>
+      <w:r>
+        <w:t>Lisa pops Davey with the towel in her hand. “I wonder…”</w:t>
+      </w:r>
+    </w:p>
+    <w:p>
+      <w:r>
+        <w:t>Davey tries to look innocent, not convincing anyone, and quickly changes the subject. Davey uses his hands like he’s presenting a prize to be won on a game show. “Jack, this is my wife Lisa.” Turning to his left, he gestures again. “And this is Lynn.”</w:t>
+      </w:r>
+    </w:p>
+    <w:p>
+      <w:r>
+        <w:t>Jack bows slightly and takes Lynn’s hand, kissing the back the way a Lord might in a fairy tale. Lynn blushes and hopes Jack doesn’t hear her heart beating quickly. He turns to take Lisa’s hand, having to bow down further because of her short stature. Some might consider her a bit on the heavy side, but Jack finds it fits her. Her loose brown curls pulled over one shoulder and almost-emerald eyes fit her robust figure. “Very nice to meet you, M’ladies.”</w:t>
+      </w:r>
+    </w:p>
+    <w:p>
+      <w:r>
+        <w:t>Lisa rolls her eyes and glances at Davey. “Oh, not another you! Nice to meet you as well. Your sister seems to have done this before. Come on kids, bedtime.”</w:t>
+      </w:r>
+    </w:p>
+    <w:p>
+      <w:r>
+        <w:t>Jack turns and watches his sister, pride flashing before softening and replying, “She has.”</w:t>
+      </w:r>
+    </w:p>
+    <w:p>
+      <w:r>
+        <w:t>Lea brings the dishes to the sink and starts washing them. Frank steps next to her, taking the dish from her hand. “Let me do that. You are the guest.”</w:t>
+      </w:r>
+    </w:p>
+    <w:p>
+      <w:r>
+        <w:lastRenderedPageBreak/>
+        <w:t>Lea takes the dish back from Frank. “Old habits die hard. Plus, I gotta pay for my supper somehow. She has what?”</w:t>
+      </w:r>
+    </w:p>
+    <w:p>
+      <w:r>
+        <w:t>Davey answers, “You have experience with kids. Lisa was remarking on how natural you are with them. Do you have children?” Frank catches the moment of sadness flashing across Jack’s face.</w:t>
+      </w:r>
+    </w:p>
+    <w:p>
+      <w:r>
+        <w:t>Lea answers without looking up from the sink. “I do have a daughter. I had a son and lost him about Sam’s age. My daughter is almost thirty now, married and expecting my first grandchild in December.” Lea shrugs off the sadness. “Man. That makes me feel old.” Frank puts an arm across her shoulders, giving her a gentle hug.</w:t>
+      </w:r>
+    </w:p>
+    <w:p>
+      <w:r>
+        <w:t>Jack tries to lighten the mood by explaining further. “It’s a pack-mentality thing. Lea has always been the mom no matter who is around. She has my two boys and another niece and can always be found in the middle with the kids. You have to watch out for her because she takes after our mother, the wolf.”</w:t>
+      </w:r>
+    </w:p>
+    <w:p>
+      <w:r>
+        <w:t>Ester’s eyes grow big. “Your mom is a wolf?”</w:t>
+      </w:r>
+    </w:p>
+    <w:p>
+      <w:r>
+        <w:t>Jack chuckles. “Yes. She is a big… gray… wolf and she raised us just like Mowgli in the Jungle Book.”</w:t>
+      </w:r>
+    </w:p>
+    <w:p>
+      <w:r>
+        <w:t>Lea uses the same tone with Jack she used on Kaya earlier. “Jack!” But he does not respond as Kaya did. He is surrounded by the kids, all wide-eyed, trying to decide if he’s telling the truth or not.</w:t>
+      </w:r>
+    </w:p>
+    <w:p>
+      <w:r>
+        <w:t>Davey goes from a smirk to a straight face, nodding. “No. Really. They have a wolf for a mother. I’ve seen her and she’s bigger than Kaya!” The kids’ heads whip around to look at Davey, faces full of shock and wonder.</w:t>
+      </w:r>
+    </w:p>
+    <w:p>
+      <w:r>
+        <w:t xml:space="preserve"> Lynn’s mama voice comes out proclaiming, “Enough of that! You heard your Aunt Lisa, time for bed. Now upstairs the lot of you.”</w:t>
+      </w:r>
+    </w:p>
+    <w:p>
+      <w:r>
+        <w:t>Torn between wanting to know more about the wolf and doing as they are told, they decide to plead their case.</w:t>
+      </w:r>
+    </w:p>
+    <w:p>
+      <w:r>
+        <w:t>“But Mom, can’t we have a bedtime story, please?” begs Sam.</w:t>
+      </w:r>
+    </w:p>
+    <w:p>
+      <w:r>
+        <w:t>Al and Lon deliver in stereo, “Please. Please. We want a story!”</w:t>
+      </w:r>
+    </w:p>
+    <w:p>
+      <w:r>
+        <w:t>Ester grabs a hold of Jack’s leg. “I’m not letting go unless I get a story.” The adults look at each other knowing they have been beaten.</w:t>
+      </w:r>
+    </w:p>
+    <w:p>
+      <w:r>
+        <w:t>Jack cocks an eyebrow at Lea, who nods in submission. “Who wants to hear about Lea getting lost in the woods and the wolf pack has to find her?”</w:t>
+      </w:r>
+    </w:p>
+    <w:p>
+      <w:r>
+        <w:lastRenderedPageBreak/>
+        <w:t>The kids light up like Roman candles secure in the fact they had won this round. Lisa gives in. “Alright, but first brush your teeth, get in your jammies, and meet us on the patio.”</w:t>
+      </w:r>
+    </w:p>
+    <w:p>
+      <w:r>
+        <w:t>Lynn starts to object, but Frank puts a hand on her shoulder. “Davey and I promised they could sleep on the patio tonight. We’ve already set up the air mattresses and sleeping bags. They just need their pillows. I guess we forgot to tell you. Lisa, how did you know?”</w:t>
+      </w:r>
+    </w:p>
+    <w:p>
+      <w:r>
+        <w:t>Lisa gives him a stern look. “I’m a mother. I always know. I had better supervise and make sure we have our bears, bunnies, and pillows.”</w:t>
+      </w:r>
+    </w:p>
+    <w:p>
+      <w:r>
+        <w:t>Lynn gives a concerned look. “Are you sure it’s already an hour later than we planned to eat? I’m afraid dinner might not be worth eating by the time we get to.”</w:t>
+      </w:r>
+    </w:p>
+    <w:p>
+      <w:r>
+        <w:t>Frank checks on the spaghetti still warming on the stove. “It’s fine and will last a while longer. Besides we’ve all been snacking on meatballs and bread. I hope you made more since the basket is empty.”</w:t>
+      </w:r>
+    </w:p>
+    <w:p>
+      <w:r>
+        <w:t>Lynn is still not convinced. “Yes. I have more. I just haven’t toasted it yet and was going to do that just before the adults got to eat. Jack, Lea, are you sure?”</w:t>
+      </w:r>
+    </w:p>
+    <w:p>
+      <w:r>
+        <w:t>Lea, putting the last plate in the dish rack, turns and gives a reassuring smile to Lynn. “It’s fine. Like Frank said, we’ve all been snacking and we can add a splash of water to keep it from drying out and burning. We’ll make it a quick story, right Jack?”</w:t>
+      </w:r>
+    </w:p>
+    <w:p>
+      <w:r>
+        <w:t>Jack smirks. “Depends if you admit you were lost this time.”</w:t>
+      </w:r>
+    </w:p>
+    <w:p>
+      <w:r>
+        <w:t>Lea replies, “Never.”</w:t>
+      </w:r>
+    </w:p>
+    <w:p>
+      <w:r>
+        <w:t>Lisa returns with a line of kids in tow. They all pass through the den to the patio</w:t>
+      </w:r>
+      <w:r>
+        <w:t>,</w:t>
+      </w:r>
+      <w:r>
+        <w:t xml:space="preserve"> and go about getting the girls, Kaya, and Snowball settled on one mattress while the boys and Selby settle on the other. It’s a nice, warm summer night in the mountains, the kind that makes adults want to sleep under the stars. Lea returns to the house, and Jack takes his position on the side edge of the chaise across from the kids. Davey and Lisa settle onto the wicker sofa. Lea and Lynn return with glasses of iced tea, handing them out before setting down a plate of </w:t>
+      </w:r>
+      <w:r>
+        <w:t>bruschetta</w:t>
+      </w:r>
+      <w:r>
+        <w:t>. Lynn curls up next to Frank on the swing as Jack begins.</w:t>
+      </w:r>
+    </w:p>
+    <w:p>
+      <w:r>
+        <w:t>“So, Lea was about your age, Ester, and we are in this great, big, valley. And there are flowers and soft grass and a big lake just right for swimming in the middle. But you don’t want to be still in that lake. If you get still, there are fish who love to nibble on toes.”</w:t>
+      </w:r>
+    </w:p>
+    <w:p>
+      <w:r>
+        <w:t xml:space="preserve">Lea interrupts the story, passing by to join Jack on the chaise as she uses the tips of her fingernails to nip at the kids’ toes, causing feet to be sucked back in and giggles to erupt. Lea looks at Frank, noticing he has pulled his feet up off the ground as well. She hands Jack his tea glass and sits next to him. Jack gives her an irritated look. She gives him an innocent look of </w:t>
       </w:r>
       <w:r>
         <w:rPr>
           <w:i/>
           <w:iCs/>
         </w:rPr>
-        <w:t>o</w:t>
+        <w:t>W</w:t>
       </w:r>
       <w:r>
         <w:rPr>
           <w:i/>
           <w:iCs/>
         </w:rPr>
-        <w:t>f Spaghetti</w:t>
-      </w:r>
-      <w:r>
-        <w:t>. The children join with the men, all singing at the top of their lungs, while the women look on in part shock, part disbelief, and part heaven help us.</w:t>
-      </w:r>
-    </w:p>
-    <w:p>
-      <w:r>
-        <w:t>The men move to the table, standing with a child on each side as they make faces and lean into the song with the kids. Lea steps back, afraid of the scene she sees coming but powerless to stop it. As they reach the last line of the parody, the kids start fake sneezing while the men start making meatballs disappear by popping them in their mouths. The kids look on in shock while the men grin from ear to ear, chewing the meatballs. Al looks at Davey and loudly proclaims, “Eww! Daddy just ate boogies!” The men choke on their meatballs while everyone else lets loose in laughter, grabbing their sides.</w:t>
-      </w:r>
-    </w:p>
-    <w:p>
-      <w:r>
-        <w:t>How nothing gets turned over and food worn on shirts is still something that amazes the women. Lea regains her posture first. “You three troublemakers back to the kitchen with you and let them finish in peace.”</w:t>
-      </w:r>
-    </w:p>
-    <w:p>
-      <w:r>
-        <w:t>Lonnie points out, “But Miss Lea, we are finished. See all plates clean.”</w:t>
-      </w:r>
-    </w:p>
-    <w:p>
-      <w:r>
-        <w:t>Sam chimes in, “Wait! We still have milk. Okay, everyone. One… two… three. Chug!” The children grab their milk glasses and start drinking it down fast like frat boys.</w:t>
-      </w:r>
-    </w:p>
-    <w:p>
-      <w:r>
-        <w:t>Lea cocks an eyebrow at Davey and Frank. “I wonder where they learned that?”</w:t>
-      </w:r>
-    </w:p>
-    <w:p>
-      <w:r>
-        <w:t>Lisa pops Davey with the towel in her hand. “I wonder…”</w:t>
-      </w:r>
-    </w:p>
-    <w:p>
-      <w:r>
-        <w:t>Davey tries to look innocent, not convincing anyone, and quickly changes the subject. Davey uses his hands like he’s presenting a prize to be won on a game show. “Jack, this is my wife Lisa.” Turning to his left, he gestures again. “And this is Lynn.”</w:t>
-      </w:r>
-    </w:p>
-    <w:p>
-      <w:r>
-        <w:t xml:space="preserve">Jack bows slightly and takes Lynn’s hand, kissing the back the way a Lord might in a fairy tale. Lynn blushes and hopes Jack doesn’t hear her heart beating quickly. He turns to take Lisa’s hand, having to bow down further because of her short stature. Some might consider her a bit on the heavy side, but Jack finds it fits her. Her loose brown curls pulled over one </w:t>
-      </w:r>
-      <w:proofErr w:type="gramStart"/>
-      <w:r>
-        <w:t>shoulder</w:t>
-      </w:r>
-      <w:proofErr w:type="gramEnd"/>
-      <w:r>
-        <w:t xml:space="preserve"> and almost-emerald eyes fit her robust figure. “Very nice to meet you, </w:t>
-      </w:r>
-      <w:proofErr w:type="spellStart"/>
-      <w:r>
-        <w:t>M’ladies</w:t>
-      </w:r>
-      <w:proofErr w:type="spellEnd"/>
-      <w:r>
-        <w:t>.”</w:t>
-      </w:r>
-    </w:p>
-    <w:p>
-      <w:r>
-        <w:t>Lisa rolls her eyes and glances at Davey. “Oh, not another you! Nice to meet you as well. Your sister seems to have done this before. Come on kids, bedtime.”</w:t>
-      </w:r>
-    </w:p>
-    <w:p>
-      <w:r>
-        <w:t>Jack turns and watches his sister, pride flashing before softening and replying, “She has.”</w:t>
-      </w:r>
-    </w:p>
-    <w:p>
-      <w:r>
-        <w:t>Lea brings the dishes to the sink and starts washing them. Frank steps next to her, taking the dish from her hand. “Let me do that. You are the guest.”</w:t>
-      </w:r>
-    </w:p>
-    <w:p>
-      <w:r>
-        <w:lastRenderedPageBreak/>
-        <w:t xml:space="preserve">Lea takes the dish back from Frank. “Old habits die hard. Plus, I </w:t>
-      </w:r>
-      <w:proofErr w:type="spellStart"/>
-      <w:r>
-        <w:t>gotta</w:t>
-      </w:r>
-      <w:proofErr w:type="spellEnd"/>
-      <w:r>
-        <w:t xml:space="preserve"> pay for my supper somehow. She has what?”</w:t>
-      </w:r>
-    </w:p>
-    <w:p>
-      <w:r>
-        <w:t>Davey answers, “You have experience with kids. Lisa was remarking on how natural you are with them. Do you have children?” Frank catches the moment of sadness flashing across Jack’s face.</w:t>
-      </w:r>
-    </w:p>
-    <w:p>
-      <w:r>
-        <w:t>Lea answers without looking up from the sink. “I do have a daughter. I had a son and lost him about Sam’s age. My daughter is almost thirty now, married and expecting my first grandchild in December.” Lea shrugs off the sadness. “Man. That makes me feel old.” Frank puts an arm across her shoulders, giving her a gentle hug.</w:t>
-      </w:r>
-    </w:p>
-    <w:p>
-      <w:r>
-        <w:t>Jack tries to lighten the mood by explaining further. “It’s a pack-mentality thing. Lea has always been the mom no matter who is around. She has my two boys and another niece and can always be found in the middle with the kids. You have to watch out for her because she takes after our mother, the wolf.”</w:t>
-      </w:r>
-    </w:p>
-    <w:p>
-      <w:r>
-        <w:t>Ester’s eyes grow big. “Your mom is a wolf?”</w:t>
-      </w:r>
-    </w:p>
-    <w:p>
-      <w:r>
-        <w:t>Jack chuckles. “Yes. She is a big… gray… wolf and she raised us just like Mowgli in the Jungle Book.”</w:t>
-      </w:r>
-    </w:p>
-    <w:p>
-      <w:r>
-        <w:t>Lea uses the same tone with Jack she used on Kaya earlier. “Jack!” But he does not respond as Kaya did. He is surrounded by the kids, all wide-eyed, trying to decide if he’s telling the truth or not.</w:t>
-      </w:r>
-    </w:p>
-    <w:p>
-      <w:r>
-        <w:t>Davey goes from a smirk to a straight face, nodding. “No. Really. They have a wolf for a mother. I’ve seen her and she’s bigger than Kaya!” The kids’ heads whip around to look at Davey, faces full of shock and wonder.</w:t>
-      </w:r>
-    </w:p>
-    <w:p>
-      <w:r>
-        <w:t xml:space="preserve"> Lynn’s mama voice comes out proclaiming, “Enough of that! You heard your Aunt Lisa, time for bed. Now upstairs the lot of you.”</w:t>
-      </w:r>
-    </w:p>
-    <w:p>
-      <w:r>
-        <w:t>Torn between wanting to know more about the wolf and doing as they are told, they decide to plead their case.</w:t>
-      </w:r>
-    </w:p>
-    <w:p>
-      <w:r>
-        <w:t>“But Mom, can’t we have a bedtime story, please?” begs Sam.</w:t>
-      </w:r>
-    </w:p>
-    <w:p>
-      <w:r>
-        <w:t>Al and Lon deliver in stereo, “Please. Please. We want a story!”</w:t>
-      </w:r>
-    </w:p>
-    <w:p>
-      <w:r>
-        <w:t>Ester grabs a hold of Jack’s leg. “I’m not letting go unless I get a story.” The adults look at each other knowing they have been beaten.</w:t>
-      </w:r>
-    </w:p>
-    <w:p>
-      <w:r>
-        <w:t>Jack cocks an eyebrow at Lea, who nods in submission. “Who wants to hear about Lea getting lost in the woods and the wolf pack has to find her?”</w:t>
-      </w:r>
-    </w:p>
-    <w:p>
-      <w:r>
-        <w:lastRenderedPageBreak/>
-        <w:t>The kids light up like Roman candles secure in the fact they had won this round. Lisa gives in. “Alright, but first brush your teeth, get in your jammies, and meet us on the patio.”</w:t>
-      </w:r>
-    </w:p>
-    <w:p>
-      <w:r>
-        <w:t>Lynn starts to object, but Frank puts a hand on her shoulder. “Davey and I promised they could sleep on the patio tonight. We’ve already set up the air mattresses and sleeping bags. They just need their pillows. I guess we forgot to tell you. Lisa, how did you know?”</w:t>
-      </w:r>
-    </w:p>
-    <w:p>
-      <w:r>
-        <w:t>Lisa gives him a stern look. “I’m a mother. I always know. I had better supervise and make sure we have our bears, bunnies, and pillows.”</w:t>
-      </w:r>
-    </w:p>
-    <w:p>
-      <w:r>
-        <w:t>Lynn gives a concerned look. “Are you sure it’s already an hour later than we planned to eat? I’m afraid dinner might not be worth eating by the time we get to.”</w:t>
-      </w:r>
-    </w:p>
-    <w:p>
-      <w:r>
-        <w:t>Frank checks on the spaghetti still warming on the stove. “It’s fine and will last a while longer. Besides we’ve all been snacking on meatballs and bread. I hope you made more since the basket is empty.”</w:t>
-      </w:r>
-    </w:p>
-    <w:p>
-      <w:r>
-        <w:t>Lynn is still not convinced. “Yes. I have more. I just haven’t toasted it yet and was going to do that just before the adults got to eat. Jack, Lea, are you sure?”</w:t>
-      </w:r>
-    </w:p>
-    <w:p>
-      <w:r>
-        <w:t>Lea, putting the last plate in the dish rack, turns and gives a reassuring smile to Lynn. “It’s fine. Like Frank said, we’ve all been snacking and we can add a splash of water to keep it from drying out and burning. We’ll make it a quick story, right Jack?”</w:t>
-      </w:r>
-    </w:p>
-    <w:p>
-      <w:r>
-        <w:t>Jack smirks. “Depends if you admit you were lost this time.”</w:t>
-      </w:r>
-    </w:p>
-    <w:p>
-      <w:r>
-        <w:t>Lea replies, “Never.”</w:t>
-      </w:r>
-    </w:p>
-    <w:p>
-      <w:r>
-        <w:t xml:space="preserve">Lisa returns with a line of kids in tow. They all pass through the den to the patio and go about getting the girls, Kaya, and Snowball settled on one mattress while the boys and Selby settle on the other. It’s a nice, warm summer night in the mountains, the kind that makes adults want to sleep under the stars. Lea returns to the house, and Jack takes his position on the side edge of the chaise across from the kids. Davey and Lisa settle onto the wicker sofa. Lea and Lynn return with glasses of iced tea, handing them out before setting down a plate of </w:t>
-      </w:r>
-      <w:r>
-        <w:t>bruschetta</w:t>
-      </w:r>
-      <w:r>
-        <w:t>. Lynn curls up next to Frank on the swing as Jack begins.</w:t>
-      </w:r>
-    </w:p>
-    <w:p>
-      <w:r>
-        <w:t>“So, Lea was about your age, Ester, and we are in this great, big, valley. And there are flowers and soft grass and a big lake just right for swimming in the middle. But you don’t want to be still in that lake. If you get still, there are fish who love to nibble on toes.”</w:t>
-      </w:r>
-    </w:p>
-    <w:p>
-      <w:r>
-        <w:t xml:space="preserve">Lea interrupts the story, passing by to join Jack on the chaise as she uses the tips of her fingernails to nip at the kids’ toes, causing feet to be sucked back in and giggles to erupt. Lea looks at Frank, noticing he has pulled his feet up off the ground as well. She hands Jack his tea glass and sits next to him. Jack gives her an irritated look. She gives him an innocent look of </w:t>
-      </w:r>
-      <w:r>
-        <w:rPr>
-          <w:i/>
-          <w:iCs/>
-        </w:rPr>
-        <w:t>what?</w:t>
+        <w:t>hat?</w:t>
       </w:r>
       <w:r>
         <w:t xml:space="preserve"> and motions for him to continue.</w:t>
@@ -641,18 +600,10 @@
     </w:p>
     <w:p>
       <w:r>
-        <w:t xml:space="preserve">“The mama bear gives a low rumbling growl. CT spins on her bottom, turning her back on her mother and facing us. I start to giggle. CT’s face breaks into a smile. The boy starts to giggle. The mama bear is having none of it. She stomps up to CT and grabs her by the scruff of the neck. CT protests with a </w:t>
-      </w:r>
-      <w:proofErr w:type="spellStart"/>
-      <w:r>
-        <w:t>m</w:t>
-      </w:r>
-      <w:r>
-        <w:t>rrr</w:t>
-      </w:r>
-      <w:proofErr w:type="spellEnd"/>
-      <w:r>
-        <w:t>–REEEP</w:t>
+        <w:t>“The mama bear gives a low rumbling growl. CT spins on her bottom, turning her back on her mother and facing us. I start to giggle. CT’s face breaks into a smile. The boy starts to giggle. The mama bear is having none of it. She stomps up to CT and grabs her by the scruff of the neck. CT protests with a m</w:t>
+      </w:r>
+      <w:r>
+        <w:t>rrr–REEEP</w:t>
       </w:r>
       <w:r>
         <w:t xml:space="preserve"> in a </w:t>
@@ -662,46 +613,13 @@
           <w:i/>
           <w:iCs/>
         </w:rPr>
-        <w:t>hey</w:t>
-      </w:r>
-      <w:r>
-        <w:rPr>
-          <w:i/>
-          <w:iCs/>
-        </w:rPr>
-        <w:t>,</w:t>
-      </w:r>
-      <w:r>
-        <w:rPr>
-          <w:i/>
-          <w:iCs/>
-        </w:rPr>
-        <w:t xml:space="preserve"> I</w:t>
-      </w:r>
-      <w:r>
-        <w:rPr>
-          <w:i/>
-          <w:iCs/>
-        </w:rPr>
-        <w:t xml:space="preserve"> a</w:t>
-      </w:r>
-      <w:r>
-        <w:rPr>
-          <w:i/>
-          <w:iCs/>
-        </w:rPr>
-        <w:t>m with friends tone</w:t>
-      </w:r>
-      <w:r>
-        <w:t xml:space="preserve">. Wiggling to get free she </w:t>
-      </w:r>
-      <w:proofErr w:type="spellStart"/>
-      <w:r>
-        <w:t>Rrraaa</w:t>
-      </w:r>
-      <w:proofErr w:type="spellEnd"/>
-      <w:r>
-        <w:t>–yip</w:t>
+        <w:t>hey, I am with friends tone.</w:t>
+      </w:r>
+      <w:r>
+        <w:t xml:space="preserve"> Wiggling to get free she </w:t>
+      </w:r>
+      <w:r>
+        <w:t>Rrraaa–yip</w:t>
       </w:r>
       <w:r>
         <w:t xml:space="preserve"> of </w:t>
@@ -716,34 +634,16 @@
       <w:r>
         <w:t xml:space="preserve"> before ending in a defiant </w:t>
       </w:r>
-      <w:proofErr w:type="spellStart"/>
-      <w:r>
-        <w:t>hff</w:t>
-      </w:r>
-      <w:proofErr w:type="spellEnd"/>
-      <w:r>
-        <w:t>–</w:t>
-      </w:r>
-      <w:proofErr w:type="spellStart"/>
-      <w:r>
-        <w:t>chrrrp</w:t>
-      </w:r>
-      <w:proofErr w:type="spellEnd"/>
+      <w:r>
+        <w:t>hff–chrrrp</w:t>
+      </w:r>
       <w:r>
         <w:t xml:space="preserve"> of surrender. CT puts one paw up in a wave of goodbye before her mother turns and takes her back to the trees.”</w:t>
       </w:r>
     </w:p>
     <w:p>
       <w:r>
-        <w:t>Al sits up and looks over at his mom. “</w:t>
-      </w:r>
-      <w:proofErr w:type="spellStart"/>
-      <w:r>
-        <w:t>Seeeee</w:t>
-      </w:r>
-      <w:proofErr w:type="spellEnd"/>
-      <w:r>
-        <w:t>, even CT gets it! Let us play with our friends.” The adults try not to giggle but hide it badly as Lisa replies, “Hush and lay back down.”</w:t>
+        <w:t>Al sits up and looks over at his mom. “Seeeee, even CT gets it! Let us play with our friends.” The adults try not to giggle but hide it badly as Lisa replies, “Hush and lay back down.”</w:t>
       </w:r>
     </w:p>
     <w:p>
@@ -756,23 +656,15 @@
           <w:i/>
           <w:iCs/>
         </w:rPr>
-        <w:t>what next</w:t>
-      </w:r>
-      <w:r>
-        <w:t>? Another wolf howl echoes through the forest, closer now. My shoulders drop, knowing I’m about to meet the same fate as CT. The boy’s eyes light up, realizing the same thing. He stands up, not letting go of my hand, and pulls me up to stand beside him. He tugs my hand gently as he heads in the direction he came from.</w:t>
-      </w:r>
-    </w:p>
-    <w:p>
-      <w:r>
-        <w:t xml:space="preserve">“We follow the path I only thought my family knew back to an area used for camping and the road to town, chatting about what we just experienced. We arrive in the camping area to see a tent erected, camping and fishing gear strewn about, and a man asleep in a lawn chair by the river. The boy puts a finger to his </w:t>
-      </w:r>
-      <w:proofErr w:type="gramStart"/>
-      <w:r>
-        <w:t>mouth</w:t>
-      </w:r>
-      <w:proofErr w:type="gramEnd"/>
-      <w:r>
-        <w:t xml:space="preserve"> so I know to stay quiet, and we sneak over to the side of the tent out of sight of his dad sleeping in the chair.</w:t>
+        <w:t>what next?</w:t>
+      </w:r>
+      <w:r>
+        <w:t xml:space="preserve"> Another wolf howl echoes through the forest, closer now. My shoulders drop, knowing I’m about to meet the same fate as CT. The boy’s eyes light up, realizing the same thing. He stands up, not letting go of my hand, and pulls me up to stand beside him. He tugs my hand gently as he heads in the direction he came from.</w:t>
+      </w:r>
+    </w:p>
+    <w:p>
+      <w:r>
+        <w:t>“We follow the path I only thought my family knew back to an area used for camping and the road to town, chatting about what we just experienced. We arrive in the camping area to see a tent erected, camping and fishing gear strewn about, and a man asleep in a lawn chair by the river. The boy puts a finger to his mouth so I know to stay quiet, and we sneak over to the side of the tent out of sight of his dad sleeping in the chair.</w:t>
       </w:r>
     </w:p>
     <w:p>
@@ -825,7 +717,13 @@
     </w:p>
     <w:p>
       <w:r>
-        <w:t>“Mom looks to the sky and knows it’s about to open up. She lithely steps over to join us and untangles Lea and the boy, making sure neither is hurt. Satisfied, she puts her hands on the boy’s shoulders, turns him around to face his father and gives him a little shove in that direction. She speaks for the first time in the whole exchange. She apologizes for the interruption and tells him she hates to say hello and goodbye, but we all need to get in out of the storm. She scoops Lea up in her arms and pushes me to the path back to the valley as Gran-ma-ma sprints past us leading the way.</w:t>
+        <w:t>“Mom looks to the sky and knows it’s about to open up. She lithely steps over to join us and untangles Lea and the boy, making sure neither is hurt. Satisfied, she puts her hands on the boy’s shoulders, turns him around to face his father</w:t>
+      </w:r>
+      <w:r>
+        <w:t>,</w:t>
+      </w:r>
+      <w:r>
+        <w:t xml:space="preserve"> and gives him a little shove in that direction. She speaks for the first time in the whole exchange. She apologizes for the interruption and tells him she hates to say hello and goodbye, but we all need to get in out of the storm. She scoops Lea up in her arms and pushes me to the path back to the valley as Gran-ma-ma sprints past us leading the way.</w:t>
       </w:r>
     </w:p>
     <w:p>
@@ -1243,7 +1141,7 @@
   <w:style w:type="paragraph" w:default="1" w:styleId="Normal">
     <w:name w:val="Normal"/>
     <w:qFormat/>
-    <w:rsid w:val="006B002E"/>
+    <w:rsid w:val="007E1A15"/>
     <w:pPr>
       <w:keepNext/>
       <w:keepLines/>
@@ -1273,19 +1171,19 @@
     <w:basedOn w:val="Normal"/>
     <w:next w:val="Normal"/>
     <w:link w:val="Heading2Char"/>
+    <w:autoRedefine/>
     <w:uiPriority w:val="9"/>
-    <w:semiHidden/>
     <w:unhideWhenUsed/>
     <w:qFormat/>
-    <w:rsid w:val="0051428B"/>
+    <w:rsid w:val="007E1A15"/>
     <w:pPr>
-      <w:spacing w:before="160" w:after="80"/>
+      <w:spacing w:after="240"/>
+      <w:jc w:val="center"/>
       <w:outlineLvl w:val="1"/>
     </w:pPr>
     <w:rPr>
       <w:rFonts w:eastAsiaTheme="majorEastAsia" w:cstheme="majorBidi"/>
-      <w:color w:val="365F91" w:themeColor="accent1" w:themeShade="BF"/>
-      <w:sz w:val="32"/>
+      <w:sz w:val="56"/>
       <w:szCs w:val="32"/>
     </w:rPr>
   </w:style>
@@ -1462,12 +1360,10 @@
     <w:basedOn w:val="DefaultParagraphFont"/>
     <w:link w:val="Heading2"/>
     <w:uiPriority w:val="9"/>
-    <w:semiHidden/>
-    <w:rsid w:val="0051428B"/>
+    <w:rsid w:val="007E1A15"/>
     <w:rPr>
       <w:rFonts w:ascii="Times New Roman" w:eastAsiaTheme="majorEastAsia" w:hAnsi="Times New Roman" w:cstheme="majorBidi"/>
-      <w:color w:val="365F91" w:themeColor="accent1" w:themeShade="BF"/>
-      <w:sz w:val="32"/>
+      <w:sz w:val="56"/>
       <w:szCs w:val="32"/>
     </w:rPr>
   </w:style>

</xml_diff>